<commit_message>
Ajustes a documento de entrega
</commit_message>
<xml_diff>
--- a/diagrams/Diagramas_CalculosNumericos.docx
+++ b/diagrams/Diagramas_CalculosNumericos.docx
@@ -97,7 +97,16 @@
           <w:sz w:val="40"/>
           <w:szCs w:val="40"/>
         </w:rPr>
-        <w:t>Diagramas - Ejercicio CalculosNumericos</w:t>
+        <w:t xml:space="preserve">Ejercicio 6.6 Catchs multiples: Diagramas de la clase </w:t>
+      </w:r>
+      <w:r>
+        <w:rPr>
+          <w:b/>
+          <w:bCs/>
+          <w:sz w:val="40"/>
+          <w:szCs w:val="40"/>
+        </w:rPr>
+        <w:t>CalculosNumericos</w:t>
       </w:r>
     </w:p>
     <w:p>
@@ -245,6 +254,21 @@
         <w:t>El actor “Usuario” interactua con el sistema CalculosNumericos a traves de dos casos de uso: “Calcular logaritmo neperiano” y “Calcular raiz cuadrada”, ambos iniciados por el usuario al introducir un valor numerico.</w:t>
       </w:r>
     </w:p>
+    <w:p/>
+    <w:p>
+      <w:r>
+        <w:t xml:space="preserve">Link al Repositorio: </w:t>
+      </w:r>
+      <w:hyperlink r:id="rId8" w:history="1">
+        <w:r>
+          <w:rPr>
+            <w:rStyle w:val="Hyperlink"/>
+          </w:rPr>
+          <w:t>https://github.com/irojasu-jpg/Ejercicio-CalculosNumericos.git</w:t>
+        </w:r>
+      </w:hyperlink>
+    </w:p>
+    <w:p/>
     <w:sectPr>
       <w:pgSz w:w="12240" w:h="15840"/>
       <w:pgMar w:top="1440" w:right="1440" w:bottom="1440" w:left="1440" w:header="708" w:footer="708" w:gutter="0"/>
@@ -952,6 +976,18 @@
       <w:szCs w:val="20"/>
     </w:rPr>
   </w:style>
+  <w:style w:type="character" w:styleId="UnresolvedMention">
+    <w:name w:val="Unresolved Mention"/>
+    <w:basedOn w:val="DefaultParagraphFont"/>
+    <w:uiPriority w:val="99"/>
+    <w:semiHidden/>
+    <w:unhideWhenUsed/>
+    <w:rsid w:val="00347915"/>
+    <w:rPr>
+      <w:color w:val="605E5C"/>
+      <w:shd w:val="clear" w:color="auto" w:fill="E1DFDD"/>
+    </w:rPr>
+  </w:style>
 </w:styles>
 </file>
 

</xml_diff>